<commit_message>
Relés: conexión final en todos los documentos y resistencias de protección con margen
- Resistencia de protección: 220 Ω 2 W hasta 15 V y 470 Ω 3 W de 15 a 30 V
  (con un corto, a 15 V disipa 1,02 W y a 30 V 1,9 W: con 1 W y 2 W quedaba
  al límite). Diagramas regenerados.
- Conexionado del Nivel 2 (figura 2 nueva), Guía de los Bloques C y D y
  Estado del proyecto con la conexión final; las conexiones en paralelo o
  en serie con el lector quedan descartadas.
- Planillas de componentes: zócalo DIP-6, resistencia de protección,
  10 kΩ ½ W y borneras de 4 vías (precio a completar, los totales no
  cambian). Componentes en placa se imprime apaisada y sin texto cortado.
- config.h y la prueba de mesa del relé: comentarios al día (el firmware
  viene con PORCENTAJE_SELECCION en 0).
- Guía LCA110: 10 páginas, aclaración de la resistencia de 330 Ω.

Co-Authored-By: Claude Opus 5.5 <noreply@anthropic.com>
Claude-Session: https://claude.ai/code/session_01QiY8ZZNAM9gwPKiqSkCaaj
</commit_message>
<xml_diff>
--- a/documentacion_proyecto/Conexionado_Nivel2.docx
+++ b/documentacion_proyecto/Conexionado_Nivel2.docx
@@ -1527,7 +1527,7 @@
           <w:sz w:val="21"/>
           <w:szCs w:val="21"/>
         </w:rPr>
-        <w:t xml:space="preserve">El objetivo es que el dibujo venga de la aplicación en lugar de la cinta de papel. El telar ya tiene las cuatro bobinas de selección instaladas y funcionando: el sistema no las toca, sino que corta la señal del lector óptico que las comanda.</w:t>
+        <w:t xml:space="preserve">El objetivo es que el dibujo venga de la aplicación en lugar de la cinta de papel. El telar ya tiene las cuatro bobinas de selección instaladas y funcionando: el sistema no las toca. Con agujero, el lector óptico da la señal que activa la bobina; en la conexión final, la más segura, el relé ocupa el lugar del lector y da esa señal cuando el microcontrolador lo pide.</w:t>
       </w:r>
     </w:p>
     <w:p>
@@ -1538,7 +1538,7 @@
       <w:r>
         <w:drawing>
           <wp:inline distT="0" distB="0" distL="0" distR="0">
-            <wp:extent cx="5715000" cy="3733800"/>
+            <wp:extent cx="5715000" cy="4637314"/>
             <wp:effectExtent t="0" r="0" b="0" l="0"/>
             <wp:docPr id="1" name="" descr="" title=""/>
             <wp:cNvGraphicFramePr>
@@ -1563,7 +1563,7 @@
                   <pic:spPr bwMode="auto">
                     <a:xfrm>
                       <a:off x="0" y="0"/>
-                      <a:ext cx="5715000" cy="3733800"/>
+                      <a:ext cx="5715000" cy="4637314"/>
                     </a:xfrm>
                     <a:prstGeom prst="rect">
                       <a:avLst/>
@@ -1590,7 +1590,7 @@
           <w:sz w:val="17"/>
           <w:szCs w:val="17"/>
         </w:rPr>
-        <w:t xml:space="preserve">Figura 2. Canal completo de un relé, con las dos formas posibles de conectarlo al lector óptico.</w:t>
+        <w:t xml:space="preserve">Figura 2. La conexión final de un canal: el relé en el lugar del lector, con la resistencia de protección y la de 10 kΩ ½ W.</w:t>
       </w:r>
     </w:p>
     <w:p>
@@ -1787,7 +1787,7 @@
                 <w:sz w:val="17"/>
                 <w:szCs w:val="17"/>
               </w:rPr>
-              <w:t xml:space="preserve">Resistencia de 10 kΩ</w:t>
+              <w:t xml:space="preserve">Resistencia de 10 kΩ ¼ W</w:t>
             </w:r>
           </w:p>
         </w:tc>
@@ -1831,6 +1831,94 @@
                 <w:sz w:val="17"/>
                 <w:szCs w:val="17"/>
               </w:rPr>
+              <w:t xml:space="preserve">Resistencia de protección</w:t>
+            </w:r>
+          </w:p>
+        </w:tc>
+        <w:tc>
+          <w:tcPr>
+            <w:tcW w:type="dxa" w:w="6400"/>
+            <w:tcMar>
+              <w:top w:type="dxa" w:w="70"/>
+              <w:left w:type="dxa" w:w="100"/>
+              <w:bottom w:type="dxa" w:w="70"/>
+              <w:right w:type="dxa" w:w="100"/>
+            </w:tcMar>
+          </w:tcPr>
+          <w:p>
+            <w:r>
+              <w:rPr>
+                <w:rFonts w:ascii="IBM Plex Sans" w:cs="IBM Plex Sans" w:eastAsia="IBM Plex Sans" w:hAnsi="IBM Plex Sans"/>
+                <w:sz w:val="17"/>
+                <w:szCs w:val="17"/>
+              </w:rPr>
+              <w:t xml:space="preserve">Del + del conector del lector a la pata 4: 220 Ω 2 W si el lector se alimenta con hasta 15 V; 470 Ω 3 W de 15 a 30 V. Limita la corriente si hay un error de cableado.</w:t>
+            </w:r>
+          </w:p>
+        </w:tc>
+      </w:tr>
+      <w:tr>
+        <w:tc>
+          <w:tcPr>
+            <w:tcW w:type="dxa" w:w="2400"/>
+            <w:tcMar>
+              <w:top w:type="dxa" w:w="70"/>
+              <w:left w:type="dxa" w:w="100"/>
+              <w:bottom w:type="dxa" w:w="70"/>
+              <w:right w:type="dxa" w:w="100"/>
+            </w:tcMar>
+          </w:tcPr>
+          <w:p>
+            <w:r>
+              <w:rPr>
+                <w:rFonts w:ascii="IBM Plex Sans" w:cs="IBM Plex Sans" w:eastAsia="IBM Plex Sans" w:hAnsi="IBM Plex Sans"/>
+                <w:sz w:val="17"/>
+                <w:szCs w:val="17"/>
+              </w:rPr>
+              <w:t xml:space="preserve">Resistencia de 10 kΩ ½ W</w:t>
+            </w:r>
+          </w:p>
+        </w:tc>
+        <w:tc>
+          <w:tcPr>
+            <w:tcW w:type="dxa" w:w="6400"/>
+            <w:tcMar>
+              <w:top w:type="dxa" w:w="70"/>
+              <w:left w:type="dxa" w:w="100"/>
+              <w:bottom w:type="dxa" w:w="70"/>
+              <w:right w:type="dxa" w:w="100"/>
+            </w:tcMar>
+          </w:tcPr>
+          <w:p>
+            <w:r>
+              <w:rPr>
+                <w:rFonts w:ascii="IBM Plex Sans" w:cs="IBM Plex Sans" w:eastAsia="IBM Plex Sans" w:hAnsi="IBM Plex Sans"/>
+                <w:sz w:val="17"/>
+                <w:szCs w:val="17"/>
+              </w:rPr>
+              <w:t xml:space="preserve">De la señal al − del conector: con el relé abierto deja la señal en 0 V, como con papel.</w:t>
+            </w:r>
+          </w:p>
+        </w:tc>
+      </w:tr>
+      <w:tr>
+        <w:tc>
+          <w:tcPr>
+            <w:tcW w:type="dxa" w:w="2400"/>
+            <w:tcMar>
+              <w:top w:type="dxa" w:w="70"/>
+              <w:left w:type="dxa" w:w="100"/>
+              <w:bottom w:type="dxa" w:w="70"/>
+              <w:right w:type="dxa" w:w="100"/>
+            </w:tcMar>
+          </w:tcPr>
+          <w:p>
+            <w:r>
+              <w:rPr>
+                <w:rFonts w:ascii="IBM Plex Sans" w:cs="IBM Plex Sans" w:eastAsia="IBM Plex Sans" w:hAnsi="IBM Plex Sans"/>
+                <w:sz w:val="17"/>
+                <w:szCs w:val="17"/>
+              </w:rPr>
               <w:t xml:space="preserve">Cable y borneras</w:t>
             </w:r>
           </w:p>
@@ -1852,7 +1940,7 @@
                 <w:sz w:val="17"/>
                 <w:szCs w:val="17"/>
               </w:rPr>
-              <w:t xml:space="preserve">Del gabinete a los lectores ópticos del telar.</w:t>
+              <w:t xml:space="preserve">Del gabinete al conector de cada lector en la plaqueta. Una bornera para dejar los cables del lector marcados y aislados.</w:t>
             </w:r>
           </w:p>
         </w:tc>
@@ -1924,7 +2012,7 @@
           <w:sz w:val="21"/>
           <w:szCs w:val="21"/>
         </w:rPr>
-        <w:t xml:space="preserve">Con el telar encendido, y sin desconectar nada, solo apoyando las puntas del multímetro:</w:t>
+        <w:t xml:space="preserve">Con el telar encendido, sin tejer y sin desconectar nada, solo apoyando las puntas del multímetro sobre el conector del lector en la plaqueta:</w:t>
       </w:r>
     </w:p>
     <w:p>
@@ -1972,7 +2060,7 @@
           <w:sz w:val="21"/>
           <w:szCs w:val="21"/>
         </w:rPr>
-        <w:t xml:space="preserve">Corriente: </w:t>
+        <w:t xml:space="preserve">Alimentación: </w:t>
       </w:r>
       <w:r>
         <w:rPr>
@@ -1980,7 +2068,7 @@
           <w:sz w:val="21"/>
           <w:szCs w:val="21"/>
         </w:rPr>
-        <w:t xml:space="preserve">el multímetro en amperes, en serie. Empezar por la escala más alta e ir bajando.</w:t>
+        <w:t xml:space="preserve">la tensión entre el + y el − del conector. Define la resistencia de protección: 220 Ω 2 W hasta 15 V, 470 Ω 3 W de 15 a 30 V. Con más de 30 V, consultar.</w:t>
       </w:r>
     </w:p>
     <w:p>
@@ -2008,7 +2096,7 @@
           <w:sz w:val="21"/>
           <w:szCs w:val="21"/>
         </w:rPr>
-        <w:t xml:space="preserve">observar si la tensión sube o baja cuando pasa un agujero frente al lector. Esto define si el relé va en serie o en paralelo.</w:t>
+        <w:t xml:space="preserve">la señal contra el −, avanzando la cinta con el botón Impulso. Con papel tiene que dar unos 0 V y con agujero, cerca de +V: eso confirma la conexión final. Si da al revés, es la variante 2B (la guía de los relés la explica).</w:t>
       </w:r>
     </w:p>
     <w:p>
@@ -2411,7 +2499,7 @@
                 <w:sz w:val="17"/>
                 <w:szCs w:val="17"/>
               </w:rPr>
-              <w:t>Salida</w:t>
+              <w:t xml:space="preserve">Salida</w:t>
             </w:r>
           </w:p>
         </w:tc>
@@ -2432,7 +2520,7 @@
                 <w:sz w:val="17"/>
                 <w:szCs w:val="17"/>
               </w:rPr>
-              <w:t>Un hilo del circuito del lector óptico</w:t>
+              <w:t xml:space="preserve">El + del conector del lector, a través de la resistencia de protección</w:t>
             </w:r>
           </w:p>
         </w:tc>
@@ -2520,7 +2608,7 @@
                 <w:sz w:val="17"/>
                 <w:szCs w:val="17"/>
               </w:rPr>
-              <w:t>6</w:t>
+              <w:t xml:space="preserve">6</w:t>
             </w:r>
           </w:p>
         </w:tc>
@@ -2541,7 +2629,7 @@
                 <w:sz w:val="17"/>
                 <w:szCs w:val="17"/>
               </w:rPr>
-              <w:t>Salida</w:t>
+              <w:t xml:space="preserve">Salida</w:t>
             </w:r>
           </w:p>
         </w:tc>
@@ -2562,7 +2650,7 @@
                 <w:sz w:val="17"/>
                 <w:szCs w:val="17"/>
               </w:rPr>
-              <w:t>El otro hilo del circuito del lector óptico</w:t>
+              <w:t xml:space="preserve">La señal del conector del lector</w:t>
             </w:r>
           </w:p>
         </w:tc>
@@ -2720,237 +2808,99 @@
           <w:sz w:val="21"/>
           <w:szCs w:val="21"/>
         </w:rPr>
-        <w:t>Las patas 4 y 6 van en el circuito del lector óptico; la 3 y la 5 quedan sin conectar. Cómo se colocan depende de lo que haya dado la medición del paso 1:</w:t>
-      </w:r>
-    </w:p>
-    <w:tbl>
-      <w:tblPr>
-        <w:tblW w:type="dxa" w:w="8800"/>
-        <w:tblBorders>
-          <w:top w:val="single" w:color="auto" w:sz="4"/>
-          <w:left w:val="single" w:color="auto" w:sz="4"/>
-          <w:bottom w:val="single" w:color="auto" w:sz="4"/>
-          <w:right w:val="single" w:color="auto" w:sz="4"/>
-          <w:insideH w:val="single" w:color="auto" w:sz="4"/>
-          <w:insideV w:val="single" w:color="auto" w:sz="4"/>
-        </w:tblBorders>
-      </w:tblPr>
-      <w:tblGrid>
-        <w:gridCol w:w="2600"/>
-        <w:gridCol w:w="2900"/>
-        <w:gridCol w:w="3300"/>
-      </w:tblGrid>
-      <w:tr>
-        <w:trPr>
-          <w:tblHeader/>
-        </w:trPr>
-        <w:tc>
-          <w:tcPr>
-            <w:tcW w:type="dxa" w:w="2600"/>
-            <w:shd w:fill="1E3A5F" w:val="clear"/>
-            <w:tcMar>
-              <w:top w:type="dxa" w:w="70"/>
-              <w:left w:type="dxa" w:w="100"/>
-              <w:bottom w:type="dxa" w:w="70"/>
-              <w:right w:type="dxa" w:w="100"/>
-            </w:tcMar>
-          </w:tcPr>
-          <w:p>
-            <w:r>
-              <w:rPr>
-                <w:rFonts w:ascii="IBM Plex Sans" w:cs="IBM Plex Sans" w:eastAsia="IBM Plex Sans" w:hAnsi="IBM Plex Sans"/>
-                <w:b/>
-                <w:bCs/>
-                <w:color w:val="FFFFFF"/>
-                <w:sz w:val="18"/>
-                <w:szCs w:val="18"/>
-              </w:rPr>
-              <w:t xml:space="preserve">Si el agujero del papel…</w:t>
-            </w:r>
-          </w:p>
-        </w:tc>
-        <w:tc>
-          <w:tcPr>
-            <w:tcW w:type="dxa" w:w="2900"/>
-            <w:shd w:fill="1E3A5F" w:val="clear"/>
-            <w:tcMar>
-              <w:top w:type="dxa" w:w="70"/>
-              <w:left w:type="dxa" w:w="100"/>
-              <w:bottom w:type="dxa" w:w="70"/>
-              <w:right w:type="dxa" w:w="100"/>
-            </w:tcMar>
-          </w:tcPr>
-          <w:p>
-            <w:r>
-              <w:rPr>
-                <w:rFonts w:ascii="IBM Plex Sans" w:cs="IBM Plex Sans" w:eastAsia="IBM Plex Sans" w:hAnsi="IBM Plex Sans"/>
-                <w:b/>
-                <w:bCs/>
-                <w:color w:val="FFFFFF"/>
-                <w:sz w:val="18"/>
-                <w:szCs w:val="18"/>
-              </w:rPr>
-              <w:t xml:space="preserve">El relé va…</w:t>
-            </w:r>
-          </w:p>
-        </w:tc>
-        <w:tc>
-          <w:tcPr>
-            <w:tcW w:type="dxa" w:w="3300"/>
-            <w:shd w:fill="1E3A5F" w:val="clear"/>
-            <w:tcMar>
-              <w:top w:type="dxa" w:w="70"/>
-              <w:left w:type="dxa" w:w="100"/>
-              <w:bottom w:type="dxa" w:w="70"/>
-              <w:right w:type="dxa" w:w="100"/>
-            </w:tcMar>
-          </w:tcPr>
-          <w:p>
-            <w:r>
-              <w:rPr>
-                <w:rFonts w:ascii="IBM Plex Sans" w:cs="IBM Plex Sans" w:eastAsia="IBM Plex Sans" w:hAnsi="IBM Plex Sans"/>
-                <w:b/>
-                <w:bCs/>
-                <w:color w:val="FFFFFF"/>
-                <w:sz w:val="18"/>
-                <w:szCs w:val="18"/>
-              </w:rPr>
-              <w:t xml:space="preserve">Porque…</w:t>
-            </w:r>
-          </w:p>
-        </w:tc>
-      </w:tr>
-      <w:tr>
-        <w:tc>
-          <w:tcPr>
-            <w:tcW w:type="dxa" w:w="2600"/>
-            <w:tcMar>
-              <w:top w:type="dxa" w:w="70"/>
-              <w:left w:type="dxa" w:w="100"/>
-              <w:bottom w:type="dxa" w:w="70"/>
-              <w:right w:type="dxa" w:w="100"/>
-            </w:tcMar>
-          </w:tcPr>
-          <w:p>
-            <w:r>
-              <w:rPr>
-                <w:rFonts w:ascii="IBM Plex Sans" w:cs="IBM Plex Sans" w:eastAsia="IBM Plex Sans" w:hAnsi="IBM Plex Sans"/>
-                <w:sz w:val="17"/>
-                <w:szCs w:val="17"/>
-              </w:rPr>
-              <w:t xml:space="preserve">CIERRA el circuito</w:t>
-            </w:r>
-          </w:p>
-        </w:tc>
-        <w:tc>
-          <w:tcPr>
-            <w:tcW w:type="dxa" w:w="2900"/>
-            <w:tcMar>
-              <w:top w:type="dxa" w:w="70"/>
-              <w:left w:type="dxa" w:w="100"/>
-              <w:bottom w:type="dxa" w:w="70"/>
-              <w:right w:type="dxa" w:w="100"/>
-            </w:tcMar>
-          </w:tcPr>
-          <w:p>
-            <w:r>
-              <w:rPr>
-                <w:rFonts w:ascii="IBM Plex Sans" w:cs="IBM Plex Sans" w:eastAsia="IBM Plex Sans" w:hAnsi="IBM Plex Sans"/>
-                <w:sz w:val="17"/>
-                <w:szCs w:val="17"/>
-              </w:rPr>
-              <w:t xml:space="preserve">En paralelo con el lector</w:t>
-            </w:r>
-          </w:p>
-        </w:tc>
-        <w:tc>
-          <w:tcPr>
-            <w:tcW w:type="dxa" w:w="3300"/>
-            <w:tcMar>
-              <w:top w:type="dxa" w:w="70"/>
-              <w:left w:type="dxa" w:w="100"/>
-              <w:bottom w:type="dxa" w:w="70"/>
-              <w:right w:type="dxa" w:w="100"/>
-            </w:tcMar>
-          </w:tcPr>
-          <w:p>
-            <w:r>
-              <w:rPr>
-                <w:rFonts w:ascii="IBM Plex Sans" w:cs="IBM Plex Sans" w:eastAsia="IBM Plex Sans" w:hAnsi="IBM Plex Sans"/>
-                <w:sz w:val="17"/>
-                <w:szCs w:val="17"/>
-              </w:rPr>
-              <w:t xml:space="preserve">Cerrar el relé equivale a que pase un agujero</w:t>
-            </w:r>
-          </w:p>
-        </w:tc>
-      </w:tr>
-      <w:tr>
-        <w:tc>
-          <w:tcPr>
-            <w:tcW w:type="dxa" w:w="2600"/>
-            <w:tcMar>
-              <w:top w:type="dxa" w:w="70"/>
-              <w:left w:type="dxa" w:w="100"/>
-              <w:bottom w:type="dxa" w:w="70"/>
-              <w:right w:type="dxa" w:w="100"/>
-            </w:tcMar>
-          </w:tcPr>
-          <w:p>
-            <w:r>
-              <w:rPr>
-                <w:rFonts w:ascii="IBM Plex Sans" w:cs="IBM Plex Sans" w:eastAsia="IBM Plex Sans" w:hAnsi="IBM Plex Sans"/>
-                <w:sz w:val="17"/>
-                <w:szCs w:val="17"/>
-              </w:rPr>
-              <w:t xml:space="preserve">ABRE el circuito</w:t>
-            </w:r>
-          </w:p>
-        </w:tc>
-        <w:tc>
-          <w:tcPr>
-            <w:tcW w:type="dxa" w:w="2900"/>
-            <w:tcMar>
-              <w:top w:type="dxa" w:w="70"/>
-              <w:left w:type="dxa" w:w="100"/>
-              <w:bottom w:type="dxa" w:w="70"/>
-              <w:right w:type="dxa" w:w="100"/>
-            </w:tcMar>
-          </w:tcPr>
-          <w:p>
-            <w:r>
-              <w:rPr>
-                <w:rFonts w:ascii="IBM Plex Sans" w:cs="IBM Plex Sans" w:eastAsia="IBM Plex Sans" w:hAnsi="IBM Plex Sans"/>
-                <w:sz w:val="17"/>
-                <w:szCs w:val="17"/>
-              </w:rPr>
-              <w:t xml:space="preserve">En serie, intercalado en un hilo</w:t>
-            </w:r>
-          </w:p>
-        </w:tc>
-        <w:tc>
-          <w:tcPr>
-            <w:tcW w:type="dxa" w:w="3300"/>
-            <w:tcMar>
-              <w:top w:type="dxa" w:w="70"/>
-              <w:left w:type="dxa" w:w="100"/>
-              <w:bottom w:type="dxa" w:w="70"/>
-              <w:right w:type="dxa" w:w="100"/>
-            </w:tcMar>
-          </w:tcPr>
-          <w:p>
-            <w:r>
-              <w:rPr>
-                <w:rFonts w:ascii="IBM Plex Sans" w:cs="IBM Plex Sans" w:eastAsia="IBM Plex Sans" w:hAnsi="IBM Plex Sans"/>
-                <w:sz w:val="17"/>
-                <w:szCs w:val="17"/>
-              </w:rPr>
-              <w:t xml:space="preserve">Abrir el relé equivale al agujero</w:t>
-            </w:r>
-          </w:p>
-        </w:tc>
-      </w:tr>
-    </w:tbl>
+        <w:t xml:space="preserve">Con el telar apagado y desenchufado. Se hace en el conector del lector en la plaqueta, en cada canal; las patas 3 y 5 quedan sin conectar:</w:t>
+      </w:r>
+    </w:p>
+    <w:p>
+      <w:pPr>
+        <w:pStyle w:val="ListParagraph"/>
+        <w:numPr>
+          <w:ilvl w:val="0"/>
+          <w:numId w:val="2"/>
+        </w:numPr>
+        <w:spacing w:after="80"/>
+      </w:pPr>
+      <w:r>
+        <w:rPr>
+          <w:rFonts w:ascii="IBM Plex Sans" w:cs="IBM Plex Sans" w:eastAsia="IBM Plex Sans" w:hAnsi="IBM Plex Sans"/>
+          <w:sz w:val="21"/>
+          <w:szCs w:val="21"/>
+        </w:rPr>
+        <w:t xml:space="preserve">Desconectar los 4 cables del lector de la plaqueta, marcarlos en las dos puntas con cinta de color y aislarlos en su bornera, para poder volver a conectarlo.</w:t>
+      </w:r>
+    </w:p>
+    <w:p>
+      <w:pPr>
+        <w:pStyle w:val="ListParagraph"/>
+        <w:numPr>
+          <w:ilvl w:val="0"/>
+          <w:numId w:val="2"/>
+        </w:numPr>
+        <w:spacing w:after="80"/>
+      </w:pPr>
+      <w:r>
+        <w:rPr>
+          <w:rFonts w:ascii="IBM Plex Sans" w:cs="IBM Plex Sans" w:eastAsia="IBM Plex Sans" w:hAnsi="IBM Plex Sans"/>
+          <w:sz w:val="21"/>
+          <w:szCs w:val="21"/>
+        </w:rPr>
+        <w:t xml:space="preserve">Del + del conector, la resistencia de protección a la pata 4 del relé.</w:t>
+      </w:r>
+    </w:p>
+    <w:p>
+      <w:pPr>
+        <w:pStyle w:val="ListParagraph"/>
+        <w:numPr>
+          <w:ilvl w:val="0"/>
+          <w:numId w:val="2"/>
+        </w:numPr>
+        <w:spacing w:after="80"/>
+      </w:pPr>
+      <w:r>
+        <w:rPr>
+          <w:rFonts w:ascii="IBM Plex Sans" w:cs="IBM Plex Sans" w:eastAsia="IBM Plex Sans" w:hAnsi="IBM Plex Sans"/>
+          <w:sz w:val="21"/>
+          <w:szCs w:val="21"/>
+        </w:rPr>
+        <w:t xml:space="preserve">La pata 6 del relé a la señal del conector.</w:t>
+      </w:r>
+    </w:p>
+    <w:p>
+      <w:pPr>
+        <w:pStyle w:val="ListParagraph"/>
+        <w:numPr>
+          <w:ilvl w:val="0"/>
+          <w:numId w:val="2"/>
+        </w:numPr>
+        <w:spacing w:after="80"/>
+      </w:pPr>
+      <w:r>
+        <w:rPr>
+          <w:rFonts w:ascii="IBM Plex Sans" w:cs="IBM Plex Sans" w:eastAsia="IBM Plex Sans" w:hAnsi="IBM Plex Sans"/>
+          <w:sz w:val="21"/>
+          <w:szCs w:val="21"/>
+        </w:rPr>
+        <w:t xml:space="preserve">Una resistencia de 10 kΩ ½ W de la señal al − del conector. La referencia, unida a ese mismo −.</w:t>
+      </w:r>
+    </w:p>
+    <w:p>
+      <w:pPr>
+        <w:pStyle w:val="ListParagraph"/>
+        <w:numPr>
+          <w:ilvl w:val="0"/>
+          <w:numId w:val="2"/>
+        </w:numPr>
+        <w:spacing w:after="80"/>
+      </w:pPr>
+      <w:r>
+        <w:rPr>
+          <w:rFonts w:ascii="IBM Plex Sans" w:cs="IBM Plex Sans" w:eastAsia="IBM Plex Sans" w:hAnsi="IBM Plex Sans"/>
+          <w:sz w:val="21"/>
+          <w:szCs w:val="21"/>
+        </w:rPr>
+        <w:t xml:space="preserve">En la configuración del firmware, CANAL_ACTIVO_EN_ALTO en true, como viene: relé cerrado = agujero.</w:t>
+      </w:r>
+    </w:p>
     <w:p>
       <w:pPr>
         <w:pBdr>
@@ -2970,7 +2920,7 @@
           <w:sz w:val="20"/>
           <w:szCs w:val="20"/>
         </w:rPr>
-        <w:t xml:space="preserve">Marcar los hilos antes de cortar. </w:t>
+        <w:t xml:space="preserve">Qué pasa en cada situación. </w:t>
       </w:r>
       <w:r>
         <w:rPr>
@@ -2978,7 +2928,37 @@
           <w:sz w:val="20"/>
           <w:szCs w:val="20"/>
         </w:rPr>
-        <w:t xml:space="preserve">Una vuelta de cinta de color en cada extremo alcanza. Reconectar el circuito del lector sin haber anotado qué hilo era cuál es un problema evitable.</w:t>
+        <w:t xml:space="preserve">Si el microcontrolador pide la bobina, el relé se cierra, la señal queda en +V y la bobina se activa; mientras la misma bobina se repite, el relé queda cerrado y la aguja va y vuelve igual en cada pasada. Si no la pide, o está apagado o arrancando, el relé queda abierto y la de 10 kΩ deja la señal en 0 V, como con papel: la bobina queda en reposo. Si por un error de cableado la señal o la pata 4 tocaran el −, la resistencia de protección limita la corriente a unos 50 mA y no se daña nada.</w:t>
+      </w:r>
+    </w:p>
+    <w:p>
+      <w:pPr>
+        <w:pBdr>
+          <w:top w:val="single" w:color="EADFC8" w:sz="2"/>
+          <w:bottom w:val="single" w:color="EADFC8" w:sz="2"/>
+          <w:left w:val="single" w:color="9C5C0A" w:sz="16"/>
+          <w:right w:val="single" w:color="EADFC8" w:sz="2"/>
+        </w:pBdr>
+        <w:shd w:fill="FFF8EC" w:val="clear"/>
+        <w:spacing w:after="130" w:before="130"/>
+      </w:pPr>
+      <w:r>
+        <w:rPr>
+          <w:rFonts w:ascii="IBM Plex Sans" w:cs="IBM Plex Sans" w:eastAsia="IBM Plex Sans" w:hAnsi="IBM Plex Sans"/>
+          <w:b/>
+          <w:bCs/>
+          <w:sz w:val="20"/>
+          <w:szCs w:val="20"/>
+        </w:rPr>
+        <w:t xml:space="preserve">Por qué es la más segura. </w:t>
+      </w:r>
+      <w:r>
+        <w:rPr>
+          <w:rFonts w:ascii="IBM Plex Sans" w:cs="IBM Plex Sans" w:eastAsia="IBM Plex Sans" w:hAnsi="IBM Plex Sans"/>
+          <w:sz w:val="20"/>
+          <w:szCs w:val="20"/>
+        </w:rPr>
+        <w:t xml:space="preserve">El relé solo toca la señal del lector (pocos mA), nunca las bobinas ni su alimentación; el microcontrolador y el telar quedan aislados; el LCA110 es normalmente abierto, así que sin orden la plaqueta ve papel; la corriente queda limitada aun con un error de cableado; y es reversible: con la bornera se vuelve a conectar el lector en minutos. Las conexiones en paralelo o en serie con el lector, que se evaluaron primero, quedan descartadas.</w:t>
       </w:r>
     </w:p>
     <w:p>
@@ -3017,7 +2997,7 @@
           <w:sz w:val="21"/>
           <w:szCs w:val="21"/>
         </w:rPr>
-        <w:t xml:space="preserve">Conectar un único lector y verificar que el sistema pueda reproducir lo que hace el papel: que al activar la salida, la bobina correspondiente se accione, y que al desactivarla, no. Recién cuando ese canal funcione, armar los otros tres.</w:t>
+        <w:t xml:space="preserve">Armar un único canal. Antes de dejar el relé, poner en su lugar el multímetro (empezando por la escala de 10 A) en serie con la resistencia de protección, con el telar apagado; encenderlo sin tejer: tiene que marcar pocos mA (menos de 20) y la bobina tiene que activarse con el multímetro puesto y soltarse al sacarlo. Después, con el relé, verificar que al activar la salida la bobina se accione y que al desactivarla, no. Recién cuando ese canal funcione, armar los otros tres.</w:t>
       </w:r>
     </w:p>
     <w:p>
@@ -4159,7 +4139,7 @@
                 <w:sz w:val="17"/>
                 <w:szCs w:val="17"/>
               </w:rPr>
-              <w:t xml:space="preserve">Si el agujero del papel abre o cierra el circuito</w:t>
+              <w:t xml:space="preserve">Qué hace la señal del lector con agujero</w:t>
             </w:r>
           </w:p>
         </w:tc>
@@ -4180,7 +4160,7 @@
                 <w:sz w:val="17"/>
                 <w:szCs w:val="17"/>
               </w:rPr>
-              <w:t xml:space="preserve">Define si el relé va en serie o en paralelo, y el valor de CANAL_ACTIVO_EN_ALTO</w:t>
+              <w:t xml:space="preserve">Con agujero +V confirma la conexión final (CANAL_ACTIVO_EN_ALTO en true); con agujero 0 V sería la variante 2B</w:t>
             </w:r>
           </w:p>
         </w:tc>
@@ -4201,7 +4181,72 @@
                 <w:sz w:val="17"/>
                 <w:szCs w:val="17"/>
               </w:rPr>
-              <w:t xml:space="preserve">Con el multímetro sobre la salida de un lector, avanzando la cinta con el botón Impulso y observando en qué posición hay tensión</w:t>
+              <w:t xml:space="preserve">Con el multímetro entre la señal y el − del conector, avanzando la cinta con el botón Impulso, sin tejer</w:t>
+            </w:r>
+          </w:p>
+        </w:tc>
+      </w:tr>
+      <w:tr>
+        <w:tc>
+          <w:tcPr>
+            <w:tcW w:type="dxa" w:w="2500"/>
+            <w:tcMar>
+              <w:top w:type="dxa" w:w="70"/>
+              <w:left w:type="dxa" w:w="100"/>
+              <w:bottom w:type="dxa" w:w="70"/>
+              <w:right w:type="dxa" w:w="100"/>
+            </w:tcMar>
+          </w:tcPr>
+          <w:p>
+            <w:r>
+              <w:rPr>
+                <w:rFonts w:ascii="IBM Plex Sans" w:cs="IBM Plex Sans" w:eastAsia="IBM Plex Sans" w:hAnsi="IBM Plex Sans"/>
+                <w:sz w:val="17"/>
+                <w:szCs w:val="17"/>
+              </w:rPr>
+              <w:t xml:space="preserve">Tensión de alimentación del lector</w:t>
+            </w:r>
+          </w:p>
+        </w:tc>
+        <w:tc>
+          <w:tcPr>
+            <w:tcW w:type="dxa" w:w="2900"/>
+            <w:tcMar>
+              <w:top w:type="dxa" w:w="70"/>
+              <w:left w:type="dxa" w:w="100"/>
+              <w:bottom w:type="dxa" w:w="70"/>
+              <w:right w:type="dxa" w:w="100"/>
+            </w:tcMar>
+          </w:tcPr>
+          <w:p>
+            <w:r>
+              <w:rPr>
+                <w:rFonts w:ascii="IBM Plex Sans" w:cs="IBM Plex Sans" w:eastAsia="IBM Plex Sans" w:hAnsi="IBM Plex Sans"/>
+                <w:sz w:val="17"/>
+                <w:szCs w:val="17"/>
+              </w:rPr>
+              <w:t xml:space="preserve">Define la resistencia de protección: 220 Ω 2 W hasta 15 V, 470 Ω 3 W de 15 a 30 V</w:t>
+            </w:r>
+          </w:p>
+        </w:tc>
+        <w:tc>
+          <w:tcPr>
+            <w:tcW w:type="dxa" w:w="3500"/>
+            <w:tcMar>
+              <w:top w:type="dxa" w:w="70"/>
+              <w:left w:type="dxa" w:w="100"/>
+              <w:bottom w:type="dxa" w:w="70"/>
+              <w:right w:type="dxa" w:w="100"/>
+            </w:tcMar>
+          </w:tcPr>
+          <w:p>
+            <w:r>
+              <w:rPr>
+                <w:rFonts w:ascii="IBM Plex Sans" w:cs="IBM Plex Sans" w:eastAsia="IBM Plex Sans" w:hAnsi="IBM Plex Sans"/>
+                <w:sz w:val="17"/>
+                <w:szCs w:val="17"/>
+              </w:rPr>
+              <w:t xml:space="preserve">Con el multímetro entre el + y el − del conector del lector, sin tejer</w:t>
             </w:r>
           </w:p>
         </w:tc>
@@ -4651,7 +4696,7 @@
                 <w:sz w:val="17"/>
                 <w:szCs w:val="17"/>
               </w:rPr>
-              <w:t xml:space="preserve">Tensión en la salida de un lector óptico</w:t>
+              <w:t xml:space="preserve">Tensión de alimentación del lector (+ y − del conector)</w:t>
             </w:r>
           </w:p>
         </w:tc>
@@ -4672,7 +4717,7 @@
                 <w:sz w:val="17"/>
                 <w:szCs w:val="17"/>
               </w:rPr>
-              <w:t xml:space="preserve">Confirmar el margen del relé</w:t>
+              <w:t xml:space="preserve">Elegir la resistencia de protección</w:t>
             </w:r>
           </w:p>
         </w:tc>
@@ -4693,7 +4738,7 @@
                 <w:sz w:val="17"/>
                 <w:szCs w:val="17"/>
               </w:rPr>
-              <w:t xml:space="preserve">Con el telar encendido</w:t>
+              <w:t xml:space="preserve">Con el telar encendido, sin tejer</w:t>
             </w:r>
           </w:p>
         </w:tc>
@@ -4716,7 +4761,7 @@
                 <w:sz w:val="17"/>
                 <w:szCs w:val="17"/>
               </w:rPr>
-              <w:t xml:space="preserve">Corriente en la salida de un lector óptico</w:t>
+              <w:t xml:space="preserve">Corriente con la resistencia de protección en el lugar del relé</w:t>
             </w:r>
           </w:p>
         </w:tc>
@@ -4737,7 +4782,7 @@
                 <w:sz w:val="17"/>
                 <w:szCs w:val="17"/>
               </w:rPr>
-              <w:t xml:space="preserve">Confirmar que el LCA110 es el componente adecuado</w:t>
+              <w:t xml:space="preserve">Confirmar que el LCA110 es el componente adecuado (menos de 20 mA)</w:t>
             </w:r>
           </w:p>
         </w:tc>
@@ -4758,7 +4803,7 @@
                 <w:sz w:val="17"/>
                 <w:szCs w:val="17"/>
               </w:rPr>
-              <w:t xml:space="preserve">Con el telar encendido</w:t>
+              <w:t xml:space="preserve">Con el lector desconectado: conectar con el telar apagado y leer encendido, sin tejer</w:t>
             </w:r>
           </w:p>
         </w:tc>
@@ -4781,7 +4826,7 @@
                 <w:sz w:val="17"/>
                 <w:szCs w:val="17"/>
               </w:rPr>
-              <w:t xml:space="preserve">Si el agujero abre o cierra el circuito</w:t>
+              <w:t xml:space="preserve">Qué hace la señal con agujero</w:t>
             </w:r>
           </w:p>
         </w:tc>
@@ -4802,7 +4847,7 @@
                 <w:sz w:val="17"/>
                 <w:szCs w:val="17"/>
               </w:rPr>
-              <w:t xml:space="preserve">Definir si el relé va en serie o en paralelo</w:t>
+              <w:t xml:space="preserve">Confirmar la conexión final (con agujero, +V)</w:t>
             </w:r>
           </w:p>
         </w:tc>
@@ -4823,7 +4868,7 @@
                 <w:sz w:val="17"/>
                 <w:szCs w:val="17"/>
               </w:rPr>
-              <w:t xml:space="preserve">Con el telar encendido</w:t>
+              <w:t xml:space="preserve">Con el telar encendido, sin tejer</w:t>
             </w:r>
           </w:p>
         </w:tc>

</xml_diff>

<commit_message>
Segunda vuelta de revisión: textos, planillas, diagrama A y C y web
- Web: se quitan curCol y curPass, que ya no se usaban.
- Conexionado del Nivel 2 y guía de los Bloques C y D: la cinta se mueve a mano
  (Impulso está desconectado).
- Estimación de costos: celdas de la vida útil unidas, vida eléctrica del relé,
  4,75 V como mínimo de la fuente.
- Checklist de verificaciones: plaqueta principal en lugar de protoboard.
- Diagrama de los Bloques A y C: título (el sensor es del Nivel 2) y conexiones
  que ya no cruzan las cajas.
- Manual de instalación, autenticación, análisis del frontend, README del
  firmware y del backend, recomendaciones eléctricas y Nivel 2: datos al día.
- Migración 002: comentario de la posición al día (SQL completo regenerado).

Co-Authored-By: Claude Opus 5.5 <noreply@anthropic.com>
Claude-Session: https://claude.ai/code/session_01QiY8ZZNAM9gwPKiqSkCaaj
</commit_message>
<xml_diff>
--- a/documentacion_proyecto/Conexionado_Nivel2.docx
+++ b/documentacion_proyecto/Conexionado_Nivel2.docx
@@ -2096,7 +2096,7 @@
           <w:sz w:val="21"/>
           <w:szCs w:val="21"/>
         </w:rPr>
-        <w:t xml:space="preserve">la señal contra el −, avanzando la cinta con el botón Impulso. Con papel tiene que dar unos 0 V y con agujero, cerca de +V: eso confirma la conexión final. Si da al revés, es la variante 2B (la guía de los relés la explica).</w:t>
+        <w:t xml:space="preserve">la señal contra el −, sin tejer, moviendo la cinta a mano o poniendo un papel delante del lector. Con papel tiene que dar unos 0 V y con agujero, cerca de +V: eso confirma la conexión final. Si da al revés, es la variante 2B (la guía de los relés la explica).</w:t>
       </w:r>
     </w:p>
     <w:p>
@@ -4181,7 +4181,7 @@
                 <w:sz w:val="17"/>
                 <w:szCs w:val="17"/>
               </w:rPr>
-              <w:t xml:space="preserve">Con el multímetro entre la señal y el − del conector, avanzando la cinta con el botón Impulso, sin tejer</w:t>
+              <w:t xml:space="preserve">Con el multímetro entre la señal y el − del conector, moviendo la cinta a mano o con un papel delante del lector, sin tejer</w:t>
             </w:r>
           </w:p>
         </w:tc>

</xml_diff>

<commit_message>
Otra vuelta de revisión: modalidad de inversión, parada automática y pruebas del Nivel 2
- Estimación: la modalidad de inversión ya está definida (mixta).
- Parada automática: el campo del objetivo ya está en la base; faltan la
  condición en el firmware y el campo en la web.
- Después de la prueba en el banco, NIVEL2_INSTALADO también vuelve a false
  hasta conectar el sensor.
- Las guías ya no piden "marcha lenta" (Impulso está desconectado): el eje
  se gira a mano y la selección se prueba con el dibujo de la mesa.
- Manual de instalación: tiempo de despertar de Render y tipografías.
- PDF de los diez Word que cambiaron.

Co-Authored-By: Claude Opus 5.5 <noreply@anthropic.com>
Claude-Session: https://claude.ai/code/session_01QiY8ZZNAM9gwPKiqSkCaaj
</commit_message>
<xml_diff>
--- a/documentacion_proyecto/Conexionado_Nivel2.docx
+++ b/documentacion_proyecto/Conexionado_Nivel2.docx
@@ -593,7 +593,7 @@
           <w:sz w:val="21"/>
           <w:szCs w:val="21"/>
         </w:rPr>
-        <w:t xml:space="preserve">Es el paso que no se puede resolver desde el escritorio. Con el telar andando lento, poner un pedazo de cinta en un eje accesible y contar cuántas vueltas da mientras la máquina hace cinco pasadas. Si son cinco, la relación es uno a uno y ese es el eje. Si fueran diez, el conteo saldría al doble.</w:t>
+        <w:t xml:space="preserve">Es el paso que no se puede resolver desde el escritorio. Poner un pedazo de cinta en un eje accesible y, girándolo a mano despacio, contar cuántas vueltas da mientras la máquina hace cinco pasadas. Si son cinco, la relación es uno a uno y ese es el eje. Si fueran diez, el conteo saldría al doble.</w:t>
       </w:r>
     </w:p>
     <w:p>
@@ -4673,7 +4673,7 @@
                 <w:sz w:val="17"/>
                 <w:szCs w:val="17"/>
               </w:rPr>
-              <w:t xml:space="preserve">Con el telar andando lento</w:t>
+              <w:t xml:space="preserve">Girando el eje a mano, despacio</w:t>
             </w:r>
           </w:p>
         </w:tc>

</xml_diff>